<commit_message>
Fix: actualiza formato de lista de secuelas en plantillas
</commit_message>
<xml_diff>
--- a/templates/Borrador_Demanda_Auto_Auto.docx
+++ b/templates/Borrador_Demanda_Auto_Auto.docx
@@ -1,6 +1,6 @@
 
 <file path=word/document.xml><?xml version="1.0" encoding="utf-8"?>
-<w:document xmlns:wpc="http://schemas.microsoft.com/office/word/2010/wordprocessingCanvas" xmlns:cx="http://schemas.microsoft.com/office/drawing/2014/chartex" xmlns:cx1="http://schemas.microsoft.com/office/drawing/2015/9/8/chartex" xmlns:cx2="http://schemas.microsoft.com/office/drawing/2015/10/21/chartex" xmlns:cx3="http://schemas.microsoft.com/office/drawing/2016/5/9/chartex" xmlns:cx4="http://schemas.microsoft.com/office/drawing/2016/5/10/chartex" xmlns:cx5="http://schemas.microsoft.com/office/drawing/2016/5/11/chartex" xmlns:cx6="http://schemas.microsoft.com/office/drawing/2016/5/12/chartex" xmlns:cx7="http://schemas.microsoft.com/office/drawing/2016/5/13/chartex" xmlns:cx8="http://schemas.microsoft.com/office/drawing/2016/5/14/chartex" xmlns:mc="http://schemas.openxmlformats.org/markup-compatibility/2006" xmlns:aink="http://schemas.microsoft.com/office/drawing/2016/ink" xmlns:am3d="http://schemas.microsoft.com/office/drawing/2017/model3d" xmlns:o="urn:schemas-microsoft-com:office:office" xmlns:oel="http://schemas.microsoft.com/office/2019/extlst" xmlns:r="http://schemas.openxmlformats.org/officeDocument/2006/relationships" xmlns:m="http://schemas.openxmlformats.org/officeDocument/2006/math" xmlns:v="urn:schemas-microsoft-com:vml" xmlns:wp14="http://schemas.microsoft.com/office/word/2010/wordprocessingDrawing" xmlns:wp="http://schemas.openxmlformats.org/drawingml/2006/wordprocessingDrawing" xmlns:w10="urn:schemas-microsoft-com:office:word" xmlns:w="http://schemas.openxmlformats.org/wordprocessingml/2006/main" xmlns:w14="http://schemas.microsoft.com/office/word/2010/wordml" xmlns:w15="http://schemas.microsoft.com/office/word/2012/wordml" xmlns:w16cei="http://schemas.microsoft.com/office/word/2026/wordml/cei" xmlns:w16cex="http://schemas.microsoft.com/office/word/2018/wordml/cex" xmlns:w16cid="http://schemas.microsoft.com/office/word/2016/wordml/cid" xmlns:w16="http://schemas.microsoft.com/office/word/2018/wordml" xmlns:w16du="http://schemas.microsoft.com/office/word/2023/wordml/word16du" xmlns:w16sdtdh="http://schemas.microsoft.com/office/word/2020/wordml/sdtdatahash" xmlns:w16sdtfl="http://schemas.microsoft.com/office/word/2024/wordml/sdtformatlock" xmlns:w16se="http://schemas.microsoft.com/office/word/2015/wordml/symex" xmlns:wpg="http://schemas.microsoft.com/office/word/2010/wordprocessingGroup" xmlns:wpi="http://schemas.microsoft.com/office/word/2010/wordprocessingInk" xmlns:wne="http://schemas.microsoft.com/office/word/2006/wordml" xmlns:wps="http://schemas.microsoft.com/office/word/2010/wordprocessingShape" mc:Ignorable="w14 w15 w16se w16cid w16 w16cex w16sdtdh w16sdtfl w16du wp14">
+<w:document xmlns:wpc="http://schemas.microsoft.com/office/word/2010/wordprocessingCanvas" xmlns:cx="http://schemas.microsoft.com/office/drawing/2014/chartex" xmlns:cx1="http://schemas.microsoft.com/office/drawing/2015/9/8/chartex" xmlns:cx2="http://schemas.microsoft.com/office/drawing/2015/10/21/chartex" xmlns:cx3="http://schemas.microsoft.com/office/drawing/2016/5/9/chartex" xmlns:cx4="http://schemas.microsoft.com/office/drawing/2016/5/10/chartex" xmlns:cx5="http://schemas.microsoft.com/office/drawing/2016/5/11/chartex" xmlns:cx6="http://schemas.microsoft.com/office/drawing/2016/5/12/chartex" xmlns:cx7="http://schemas.microsoft.com/office/drawing/2016/5/13/chartex" xmlns:cx8="http://schemas.microsoft.com/office/drawing/2016/5/14/chartex" xmlns:mc="http://schemas.openxmlformats.org/markup-compatibility/2006" xmlns:aink="http://schemas.microsoft.com/office/drawing/2016/ink" xmlns:am3d="http://schemas.microsoft.com/office/drawing/2017/model3d" xmlns:o="urn:schemas-microsoft-com:office:office" xmlns:oel="http://schemas.microsoft.com/office/2019/extlst" xmlns:r="http://schemas.openxmlformats.org/officeDocument/2006/relationships" xmlns:m="http://schemas.openxmlformats.org/officeDocument/2006/math" xmlns:v="urn:schemas-microsoft-com:vml" xmlns:wp14="http://schemas.microsoft.com/office/word/2010/wordprocessingDrawing" xmlns:wp="http://schemas.openxmlformats.org/drawingml/2006/wordprocessingDrawing" xmlns:w10="urn:schemas-microsoft-com:office:word" xmlns:w="http://schemas.openxmlformats.org/wordprocessingml/2006/main" xmlns:w14="http://schemas.microsoft.com/office/word/2010/wordml" xmlns:w15="http://schemas.microsoft.com/office/word/2012/wordml" xmlns:w16cex="http://schemas.microsoft.com/office/word/2018/wordml/cex" xmlns:w16cid="http://schemas.microsoft.com/office/word/2016/wordml/cid" xmlns:w16="http://schemas.microsoft.com/office/word/2018/wordml" xmlns:w16du="http://schemas.microsoft.com/office/word/2023/wordml/word16du" xmlns:w16sdtdh="http://schemas.microsoft.com/office/word/2020/wordml/sdtdatahash" xmlns:w16sdtfl="http://schemas.microsoft.com/office/word/2024/wordml/sdtformatlock" xmlns:w16se="http://schemas.microsoft.com/office/word/2015/wordml/symex" xmlns:wpg="http://schemas.microsoft.com/office/word/2010/wordprocessingGroup" xmlns:wpi="http://schemas.microsoft.com/office/word/2010/wordprocessingInk" xmlns:wne="http://schemas.microsoft.com/office/word/2006/wordml" xmlns:wps="http://schemas.microsoft.com/office/word/2010/wordprocessingShape" mc:Ignorable="w14 w15 w16se w16cid w16 w16cex w16sdtdh w16sdtfl w16du wp14">
   <w:body>
     <w:p>
       <w:pPr>
@@ -3306,21 +3306,23 @@
     <w:p>
       <w:pPr>
         <w:spacing w:after="0" w:line="360" w:lineRule="auto"/>
-        <w:jc w:val="both"/>
-        <w:rPr>
-          <w:rFonts w:ascii="Times New Roman" w:eastAsia="Times New Roman" w:hAnsi="Times New Roman" w:cs="Times New Roman"/>
-          <w:sz w:val="24"/>
-          <w:szCs w:val="24"/>
-        </w:rPr>
-      </w:pPr>
-      <w:r>
-        <w:rPr>
-          <w:rFonts w:ascii="Times New Roman" w:eastAsia="Times New Roman" w:hAnsi="Times New Roman" w:cs="Times New Roman"/>
-          <w:sz w:val="24"/>
-          <w:szCs w:val="24"/>
-          <w:highlight w:val="yellow"/>
-        </w:rPr>
-        <w:t>{{</w:t>
+        <w:ind w:right="331"/>
+        <w:jc w:val="both"/>
+        <w:rPr>
+          <w:rFonts w:ascii="Times New Roman" w:eastAsia="Times New Roman" w:hAnsi="Times New Roman" w:cs="Times New Roman"/>
+          <w:sz w:val="24"/>
+          <w:szCs w:val="24"/>
+          <w:highlight w:val="yellow"/>
+        </w:rPr>
+      </w:pPr>
+      <w:r>
+        <w:rPr>
+          <w:rFonts w:ascii="Times New Roman" w:eastAsia="Times New Roman" w:hAnsi="Times New Roman" w:cs="Times New Roman"/>
+          <w:sz w:val="24"/>
+          <w:szCs w:val="24"/>
+          <w:highlight w:val="yellow"/>
+        </w:rPr>
+        <w:t xml:space="preserve">{%p </w:t>
       </w:r>
       <w:proofErr w:type="spellStart"/>
       <w:r>
@@ -3330,6 +3332,26 @@
           <w:szCs w:val="24"/>
           <w:highlight w:val="yellow"/>
         </w:rPr>
+        <w:t>for</w:t>
+      </w:r>
+      <w:proofErr w:type="spellEnd"/>
+      <w:r>
+        <w:rPr>
+          <w:rFonts w:ascii="Times New Roman" w:eastAsia="Times New Roman" w:hAnsi="Times New Roman" w:cs="Times New Roman"/>
+          <w:sz w:val="24"/>
+          <w:szCs w:val="24"/>
+          <w:highlight w:val="yellow"/>
+        </w:rPr>
+        <w:t xml:space="preserve"> secuela in </w:t>
+      </w:r>
+      <w:proofErr w:type="spellStart"/>
+      <w:r>
+        <w:rPr>
+          <w:rFonts w:ascii="Times New Roman" w:eastAsia="Times New Roman" w:hAnsi="Times New Roman" w:cs="Times New Roman"/>
+          <w:sz w:val="24"/>
+          <w:szCs w:val="24"/>
+          <w:highlight w:val="yellow"/>
+        </w:rPr>
         <w:t>ListadoSecuelas</w:t>
       </w:r>
       <w:proofErr w:type="spellEnd"/>
@@ -3340,11 +3362,16 @@
           <w:szCs w:val="24"/>
           <w:highlight w:val="yellow"/>
         </w:rPr>
-        <w:t>}}</w:t>
-      </w:r>
-    </w:p>
-    <w:p>
-      <w:pPr>
+        <w:t xml:space="preserve"> %}</w:t>
+      </w:r>
+    </w:p>
+    <w:p>
+      <w:pPr>
+        <w:pStyle w:val="Prrafodelista"/>
+        <w:numPr>
+          <w:ilvl w:val="0"/>
+          <w:numId w:val="8"/>
+        </w:numPr>
         <w:spacing w:after="0" w:line="360" w:lineRule="auto"/>
         <w:ind w:right="331"/>
         <w:jc w:val="both"/>
@@ -3352,8 +3379,70 @@
           <w:rFonts w:ascii="Times New Roman" w:eastAsia="Times New Roman" w:hAnsi="Times New Roman" w:cs="Times New Roman"/>
           <w:sz w:val="24"/>
           <w:szCs w:val="24"/>
-        </w:rPr>
-      </w:pPr>
+          <w:highlight w:val="yellow"/>
+        </w:rPr>
+      </w:pPr>
+      <w:proofErr w:type="gramStart"/>
+      <w:r>
+        <w:rPr>
+          <w:rFonts w:ascii="Times New Roman" w:eastAsia="Times New Roman" w:hAnsi="Times New Roman" w:cs="Times New Roman"/>
+          <w:sz w:val="24"/>
+          <w:szCs w:val="24"/>
+          <w:highlight w:val="yellow"/>
+        </w:rPr>
+        <w:t>{{ secuela</w:t>
+      </w:r>
+      <w:proofErr w:type="gramEnd"/>
+      <w:r>
+        <w:rPr>
+          <w:rFonts w:ascii="Times New Roman" w:eastAsia="Times New Roman" w:hAnsi="Times New Roman" w:cs="Times New Roman"/>
+          <w:sz w:val="24"/>
+          <w:szCs w:val="24"/>
+          <w:highlight w:val="yellow"/>
+        </w:rPr>
+        <w:t xml:space="preserve"> }}</w:t>
+      </w:r>
+    </w:p>
+    <w:p>
+      <w:pPr>
+        <w:spacing w:after="0" w:line="360" w:lineRule="auto"/>
+        <w:ind w:right="331"/>
+        <w:jc w:val="both"/>
+        <w:rPr>
+          <w:rFonts w:ascii="Times New Roman" w:eastAsia="Times New Roman" w:hAnsi="Times New Roman" w:cs="Times New Roman"/>
+          <w:sz w:val="24"/>
+          <w:szCs w:val="24"/>
+        </w:rPr>
+      </w:pPr>
+      <w:r>
+        <w:rPr>
+          <w:rFonts w:ascii="Times New Roman" w:eastAsia="Times New Roman" w:hAnsi="Times New Roman" w:cs="Times New Roman"/>
+          <w:sz w:val="24"/>
+          <w:szCs w:val="24"/>
+          <w:highlight w:val="yellow"/>
+        </w:rPr>
+        <w:t xml:space="preserve">{%p </w:t>
+      </w:r>
+      <w:proofErr w:type="spellStart"/>
+      <w:r>
+        <w:rPr>
+          <w:rFonts w:ascii="Times New Roman" w:eastAsia="Times New Roman" w:hAnsi="Times New Roman" w:cs="Times New Roman"/>
+          <w:sz w:val="24"/>
+          <w:szCs w:val="24"/>
+          <w:highlight w:val="yellow"/>
+        </w:rPr>
+        <w:t>endfor</w:t>
+      </w:r>
+      <w:proofErr w:type="spellEnd"/>
+      <w:r>
+        <w:rPr>
+          <w:rFonts w:ascii="Times New Roman" w:eastAsia="Times New Roman" w:hAnsi="Times New Roman" w:cs="Times New Roman"/>
+          <w:sz w:val="24"/>
+          <w:szCs w:val="24"/>
+          <w:highlight w:val="yellow"/>
+        </w:rPr>
+        <w:t xml:space="preserve"> %}</w:t>
+      </w:r>
     </w:p>
     <w:p>
       <w:pPr>
@@ -3560,7 +3649,16 @@
           <w:szCs w:val="24"/>
         </w:rPr>
         <w:br/>
-        <w:t>8) Miedo a circular en rodado, a los conglomerados de tránsito, sueños referidos al accidente. </w:t>
+        <w:t xml:space="preserve">8) Miedo a circular en rodado, a los conglomerados de tránsito, sueños referidos al </w:t>
+      </w:r>
+      <w:r>
+        <w:rPr>
+          <w:rFonts w:ascii="Times New Roman" w:eastAsia="Times New Roman" w:hAnsi="Times New Roman" w:cs="Times New Roman"/>
+          <w:sz w:val="24"/>
+          <w:szCs w:val="24"/>
+        </w:rPr>
+        <w:lastRenderedPageBreak/>
+        <w:t>accidente. </w:t>
       </w:r>
       <w:r>
         <w:rPr>
@@ -3569,14 +3667,6 @@
           <w:szCs w:val="24"/>
         </w:rPr>
         <w:br/>
-      </w:r>
-      <w:r>
-        <w:rPr>
-          <w:rFonts w:ascii="Times New Roman" w:eastAsia="Times New Roman" w:hAnsi="Times New Roman" w:cs="Times New Roman"/>
-          <w:sz w:val="24"/>
-          <w:szCs w:val="24"/>
-        </w:rPr>
-        <w:lastRenderedPageBreak/>
         <w:t>9) Agorafobia (Fobia a los espacios abiertos). </w:t>
       </w:r>
       <w:r>
@@ -4685,7 +4775,7 @@
           <w:sz w:val="24"/>
           <w:szCs w:val="24"/>
         </w:rPr>
-        <w:t xml:space="preserve">“Sabido es que la reparación del daño físico debe ser integral, es decir que debe comprender todos los aspectos de la vida de un individuo, o dicho de otro modo debe resarcir las disminuciones que se sufran a consecuencia del evento y que le impidan desarrollar </w:t>
+        <w:t xml:space="preserve">“Sabido es que la reparación del daño físico debe ser integral, es decir que debe comprender todos los aspectos de la vida de un individuo, o dicho de otro modo debe resarcir </w:t>
       </w:r>
       <w:r>
         <w:rPr>
@@ -4694,7 +4784,7 @@
           <w:szCs w:val="24"/>
         </w:rPr>
         <w:lastRenderedPageBreak/>
-        <w:t>normalmente todas las actividades que el sujeto realizaba, así como también, la de compensar de algún modo las expectativas frustradas” (</w:t>
+        <w:t>las disminuciones que se sufran a consecuencia del evento y que le impidan desarrollar normalmente todas las actividades que el sujeto realizaba, así como también, la de compensar de algún modo las expectativas frustradas” (</w:t>
       </w:r>
       <w:proofErr w:type="spellStart"/>
       <w:r>
@@ -5374,7 +5464,7 @@
           <w:sz w:val="24"/>
           <w:szCs w:val="24"/>
         </w:rPr>
-        <w:t xml:space="preserve"> realizar todas las actividades que venía realizando cotidianamente, desde la más trascendentales, hasta pasando por otras importantes para el mundo espiritual de un ser humano, como ir de </w:t>
+        <w:t xml:space="preserve"> realizar todas las actividades que venía realizando cotidianamente, desde la más trascendentales, hasta </w:t>
       </w:r>
       <w:r>
         <w:rPr>
@@ -5385,7 +5475,7 @@
           <w:szCs w:val="24"/>
         </w:rPr>
         <w:lastRenderedPageBreak/>
-        <w:t xml:space="preserve">visita a la casa de </w:t>
+        <w:t xml:space="preserve">pasando por otras importantes para el mundo espiritual de un ser humano, como ir de visita a la casa de </w:t>
       </w:r>
       <w:proofErr w:type="gramStart"/>
       <w:r>
@@ -15913,7 +16003,7 @@
 </file>
 
 <file path=word/endnotes.xml><?xml version="1.0" encoding="utf-8"?>
-<w:endnotes xmlns:wpc="http://schemas.microsoft.com/office/word/2010/wordprocessingCanvas" xmlns:cx="http://schemas.microsoft.com/office/drawing/2014/chartex" xmlns:cx1="http://schemas.microsoft.com/office/drawing/2015/9/8/chartex" xmlns:cx2="http://schemas.microsoft.com/office/drawing/2015/10/21/chartex" xmlns:cx3="http://schemas.microsoft.com/office/drawing/2016/5/9/chartex" xmlns:cx4="http://schemas.microsoft.com/office/drawing/2016/5/10/chartex" xmlns:cx5="http://schemas.microsoft.com/office/drawing/2016/5/11/chartex" xmlns:cx6="http://schemas.microsoft.com/office/drawing/2016/5/12/chartex" xmlns:cx7="http://schemas.microsoft.com/office/drawing/2016/5/13/chartex" xmlns:cx8="http://schemas.microsoft.com/office/drawing/2016/5/14/chartex" xmlns:mc="http://schemas.openxmlformats.org/markup-compatibility/2006" xmlns:aink="http://schemas.microsoft.com/office/drawing/2016/ink" xmlns:am3d="http://schemas.microsoft.com/office/drawing/2017/model3d" xmlns:o="urn:schemas-microsoft-com:office:office" xmlns:oel="http://schemas.microsoft.com/office/2019/extlst" xmlns:r="http://schemas.openxmlformats.org/officeDocument/2006/relationships" xmlns:m="http://schemas.openxmlformats.org/officeDocument/2006/math" xmlns:v="urn:schemas-microsoft-com:vml" xmlns:wp14="http://schemas.microsoft.com/office/word/2010/wordprocessingDrawing" xmlns:wp="http://schemas.openxmlformats.org/drawingml/2006/wordprocessingDrawing" xmlns:w10="urn:schemas-microsoft-com:office:word" xmlns:w="http://schemas.openxmlformats.org/wordprocessingml/2006/main" xmlns:w14="http://schemas.microsoft.com/office/word/2010/wordml" xmlns:w15="http://schemas.microsoft.com/office/word/2012/wordml" xmlns:w16cei="http://schemas.microsoft.com/office/word/2026/wordml/cei" xmlns:w16cex="http://schemas.microsoft.com/office/word/2018/wordml/cex" xmlns:w16cid="http://schemas.microsoft.com/office/word/2016/wordml/cid" xmlns:w16="http://schemas.microsoft.com/office/word/2018/wordml" xmlns:w16du="http://schemas.microsoft.com/office/word/2023/wordml/word16du" xmlns:w16sdtdh="http://schemas.microsoft.com/office/word/2020/wordml/sdtdatahash" xmlns:w16sdtfl="http://schemas.microsoft.com/office/word/2024/wordml/sdtformatlock" xmlns:w16se="http://schemas.microsoft.com/office/word/2015/wordml/symex" xmlns:wpg="http://schemas.microsoft.com/office/word/2010/wordprocessingGroup" xmlns:wpi="http://schemas.microsoft.com/office/word/2010/wordprocessingInk" xmlns:wne="http://schemas.microsoft.com/office/word/2006/wordml" xmlns:wps="http://schemas.microsoft.com/office/word/2010/wordprocessingShape" mc:Ignorable="w14 w15 w16se w16cid w16 w16cex w16sdtdh w16sdtfl w16du wp14">
+<w:endnotes xmlns:wpc="http://schemas.microsoft.com/office/word/2010/wordprocessingCanvas" xmlns:cx="http://schemas.microsoft.com/office/drawing/2014/chartex" xmlns:cx1="http://schemas.microsoft.com/office/drawing/2015/9/8/chartex" xmlns:cx2="http://schemas.microsoft.com/office/drawing/2015/10/21/chartex" xmlns:cx3="http://schemas.microsoft.com/office/drawing/2016/5/9/chartex" xmlns:cx4="http://schemas.microsoft.com/office/drawing/2016/5/10/chartex" xmlns:cx5="http://schemas.microsoft.com/office/drawing/2016/5/11/chartex" xmlns:cx6="http://schemas.microsoft.com/office/drawing/2016/5/12/chartex" xmlns:cx7="http://schemas.microsoft.com/office/drawing/2016/5/13/chartex" xmlns:cx8="http://schemas.microsoft.com/office/drawing/2016/5/14/chartex" xmlns:mc="http://schemas.openxmlformats.org/markup-compatibility/2006" xmlns:aink="http://schemas.microsoft.com/office/drawing/2016/ink" xmlns:am3d="http://schemas.microsoft.com/office/drawing/2017/model3d" xmlns:o="urn:schemas-microsoft-com:office:office" xmlns:oel="http://schemas.microsoft.com/office/2019/extlst" xmlns:r="http://schemas.openxmlformats.org/officeDocument/2006/relationships" xmlns:m="http://schemas.openxmlformats.org/officeDocument/2006/math" xmlns:v="urn:schemas-microsoft-com:vml" xmlns:wp14="http://schemas.microsoft.com/office/word/2010/wordprocessingDrawing" xmlns:wp="http://schemas.openxmlformats.org/drawingml/2006/wordprocessingDrawing" xmlns:w10="urn:schemas-microsoft-com:office:word" xmlns:w="http://schemas.openxmlformats.org/wordprocessingml/2006/main" xmlns:w14="http://schemas.microsoft.com/office/word/2010/wordml" xmlns:w15="http://schemas.microsoft.com/office/word/2012/wordml" xmlns:w16cex="http://schemas.microsoft.com/office/word/2018/wordml/cex" xmlns:w16cid="http://schemas.microsoft.com/office/word/2016/wordml/cid" xmlns:w16="http://schemas.microsoft.com/office/word/2018/wordml" xmlns:w16du="http://schemas.microsoft.com/office/word/2023/wordml/word16du" xmlns:w16sdtdh="http://schemas.microsoft.com/office/word/2020/wordml/sdtdatahash" xmlns:w16sdtfl="http://schemas.microsoft.com/office/word/2024/wordml/sdtformatlock" xmlns:w16se="http://schemas.microsoft.com/office/word/2015/wordml/symex" xmlns:wpg="http://schemas.microsoft.com/office/word/2010/wordprocessingGroup" xmlns:wpi="http://schemas.microsoft.com/office/word/2010/wordprocessingInk" xmlns:wne="http://schemas.microsoft.com/office/word/2006/wordml" xmlns:wps="http://schemas.microsoft.com/office/word/2010/wordprocessingShape" mc:Ignorable="w14 w15 w16se w16cid w16 w16cex w16sdtdh w16sdtfl w16du wp14">
   <w:endnote w:type="separator" w:id="-1">
     <w:p>
       <w:pPr>
@@ -15938,7 +16028,7 @@
 </file>
 
 <file path=word/footer1.xml><?xml version="1.0" encoding="utf-8"?>
-<w:ftr xmlns:wpc="http://schemas.microsoft.com/office/word/2010/wordprocessingCanvas" xmlns:cx="http://schemas.microsoft.com/office/drawing/2014/chartex" xmlns:cx1="http://schemas.microsoft.com/office/drawing/2015/9/8/chartex" xmlns:cx2="http://schemas.microsoft.com/office/drawing/2015/10/21/chartex" xmlns:cx3="http://schemas.microsoft.com/office/drawing/2016/5/9/chartex" xmlns:cx4="http://schemas.microsoft.com/office/drawing/2016/5/10/chartex" xmlns:cx5="http://schemas.microsoft.com/office/drawing/2016/5/11/chartex" xmlns:cx6="http://schemas.microsoft.com/office/drawing/2016/5/12/chartex" xmlns:cx7="http://schemas.microsoft.com/office/drawing/2016/5/13/chartex" xmlns:cx8="http://schemas.microsoft.com/office/drawing/2016/5/14/chartex" xmlns:mc="http://schemas.openxmlformats.org/markup-compatibility/2006" xmlns:aink="http://schemas.microsoft.com/office/drawing/2016/ink" xmlns:am3d="http://schemas.microsoft.com/office/drawing/2017/model3d" xmlns:o="urn:schemas-microsoft-com:office:office" xmlns:oel="http://schemas.microsoft.com/office/2019/extlst" xmlns:r="http://schemas.openxmlformats.org/officeDocument/2006/relationships" xmlns:m="http://schemas.openxmlformats.org/officeDocument/2006/math" xmlns:v="urn:schemas-microsoft-com:vml" xmlns:wp14="http://schemas.microsoft.com/office/word/2010/wordprocessingDrawing" xmlns:wp="http://schemas.openxmlformats.org/drawingml/2006/wordprocessingDrawing" xmlns:w10="urn:schemas-microsoft-com:office:word" xmlns:w="http://schemas.openxmlformats.org/wordprocessingml/2006/main" xmlns:w14="http://schemas.microsoft.com/office/word/2010/wordml" xmlns:w15="http://schemas.microsoft.com/office/word/2012/wordml" xmlns:w16cei="http://schemas.microsoft.com/office/word/2026/wordml/cei" xmlns:w16cex="http://schemas.microsoft.com/office/word/2018/wordml/cex" xmlns:w16cid="http://schemas.microsoft.com/office/word/2016/wordml/cid" xmlns:w16="http://schemas.microsoft.com/office/word/2018/wordml" xmlns:w16du="http://schemas.microsoft.com/office/word/2023/wordml/word16du" xmlns:w16sdtdh="http://schemas.microsoft.com/office/word/2020/wordml/sdtdatahash" xmlns:w16sdtfl="http://schemas.microsoft.com/office/word/2024/wordml/sdtformatlock" xmlns:w16se="http://schemas.microsoft.com/office/word/2015/wordml/symex" xmlns:wpg="http://schemas.microsoft.com/office/word/2010/wordprocessingGroup" xmlns:wpi="http://schemas.microsoft.com/office/word/2010/wordprocessingInk" xmlns:wne="http://schemas.microsoft.com/office/word/2006/wordml" xmlns:wps="http://schemas.microsoft.com/office/word/2010/wordprocessingShape" mc:Ignorable="w14 w15 w16se w16cid w16 w16cex w16sdtdh w16sdtfl w16du wp14">
+<w:ftr xmlns:wpc="http://schemas.microsoft.com/office/word/2010/wordprocessingCanvas" xmlns:cx="http://schemas.microsoft.com/office/drawing/2014/chartex" xmlns:cx1="http://schemas.microsoft.com/office/drawing/2015/9/8/chartex" xmlns:cx2="http://schemas.microsoft.com/office/drawing/2015/10/21/chartex" xmlns:cx3="http://schemas.microsoft.com/office/drawing/2016/5/9/chartex" xmlns:cx4="http://schemas.microsoft.com/office/drawing/2016/5/10/chartex" xmlns:cx5="http://schemas.microsoft.com/office/drawing/2016/5/11/chartex" xmlns:cx6="http://schemas.microsoft.com/office/drawing/2016/5/12/chartex" xmlns:cx7="http://schemas.microsoft.com/office/drawing/2016/5/13/chartex" xmlns:cx8="http://schemas.microsoft.com/office/drawing/2016/5/14/chartex" xmlns:mc="http://schemas.openxmlformats.org/markup-compatibility/2006" xmlns:aink="http://schemas.microsoft.com/office/drawing/2016/ink" xmlns:am3d="http://schemas.microsoft.com/office/drawing/2017/model3d" xmlns:o="urn:schemas-microsoft-com:office:office" xmlns:oel="http://schemas.microsoft.com/office/2019/extlst" xmlns:r="http://schemas.openxmlformats.org/officeDocument/2006/relationships" xmlns:m="http://schemas.openxmlformats.org/officeDocument/2006/math" xmlns:v="urn:schemas-microsoft-com:vml" xmlns:wp14="http://schemas.microsoft.com/office/word/2010/wordprocessingDrawing" xmlns:wp="http://schemas.openxmlformats.org/drawingml/2006/wordprocessingDrawing" xmlns:w10="urn:schemas-microsoft-com:office:word" xmlns:w="http://schemas.openxmlformats.org/wordprocessingml/2006/main" xmlns:w14="http://schemas.microsoft.com/office/word/2010/wordml" xmlns:w15="http://schemas.microsoft.com/office/word/2012/wordml" xmlns:w16cex="http://schemas.microsoft.com/office/word/2018/wordml/cex" xmlns:w16cid="http://schemas.microsoft.com/office/word/2016/wordml/cid" xmlns:w16="http://schemas.microsoft.com/office/word/2018/wordml" xmlns:w16du="http://schemas.microsoft.com/office/word/2023/wordml/word16du" xmlns:w16sdtdh="http://schemas.microsoft.com/office/word/2020/wordml/sdtdatahash" xmlns:w16sdtfl="http://schemas.microsoft.com/office/word/2024/wordml/sdtformatlock" xmlns:w16se="http://schemas.microsoft.com/office/word/2015/wordml/symex" xmlns:wpg="http://schemas.microsoft.com/office/word/2010/wordprocessingGroup" xmlns:wpi="http://schemas.microsoft.com/office/word/2010/wordprocessingInk" xmlns:wne="http://schemas.microsoft.com/office/word/2006/wordml" xmlns:wps="http://schemas.microsoft.com/office/word/2010/wordprocessingShape" mc:Ignorable="w14 w15 w16se w16cid w16 w16cex w16sdtdh w16sdtfl w16du wp14">
   <w:tbl>
     <w:tblPr>
       <w:tblW w:w="0" w:type="auto"/>
@@ -15998,7 +16088,7 @@
 </file>
 
 <file path=word/footnotes.xml><?xml version="1.0" encoding="utf-8"?>
-<w:footnotes xmlns:wpc="http://schemas.microsoft.com/office/word/2010/wordprocessingCanvas" xmlns:cx="http://schemas.microsoft.com/office/drawing/2014/chartex" xmlns:cx1="http://schemas.microsoft.com/office/drawing/2015/9/8/chartex" xmlns:cx2="http://schemas.microsoft.com/office/drawing/2015/10/21/chartex" xmlns:cx3="http://schemas.microsoft.com/office/drawing/2016/5/9/chartex" xmlns:cx4="http://schemas.microsoft.com/office/drawing/2016/5/10/chartex" xmlns:cx5="http://schemas.microsoft.com/office/drawing/2016/5/11/chartex" xmlns:cx6="http://schemas.microsoft.com/office/drawing/2016/5/12/chartex" xmlns:cx7="http://schemas.microsoft.com/office/drawing/2016/5/13/chartex" xmlns:cx8="http://schemas.microsoft.com/office/drawing/2016/5/14/chartex" xmlns:mc="http://schemas.openxmlformats.org/markup-compatibility/2006" xmlns:aink="http://schemas.microsoft.com/office/drawing/2016/ink" xmlns:am3d="http://schemas.microsoft.com/office/drawing/2017/model3d" xmlns:o="urn:schemas-microsoft-com:office:office" xmlns:oel="http://schemas.microsoft.com/office/2019/extlst" xmlns:r="http://schemas.openxmlformats.org/officeDocument/2006/relationships" xmlns:m="http://schemas.openxmlformats.org/officeDocument/2006/math" xmlns:v="urn:schemas-microsoft-com:vml" xmlns:wp14="http://schemas.microsoft.com/office/word/2010/wordprocessingDrawing" xmlns:wp="http://schemas.openxmlformats.org/drawingml/2006/wordprocessingDrawing" xmlns:w10="urn:schemas-microsoft-com:office:word" xmlns:w="http://schemas.openxmlformats.org/wordprocessingml/2006/main" xmlns:w14="http://schemas.microsoft.com/office/word/2010/wordml" xmlns:w15="http://schemas.microsoft.com/office/word/2012/wordml" xmlns:w16cei="http://schemas.microsoft.com/office/word/2026/wordml/cei" xmlns:w16cex="http://schemas.microsoft.com/office/word/2018/wordml/cex" xmlns:w16cid="http://schemas.microsoft.com/office/word/2016/wordml/cid" xmlns:w16="http://schemas.microsoft.com/office/word/2018/wordml" xmlns:w16du="http://schemas.microsoft.com/office/word/2023/wordml/word16du" xmlns:w16sdtdh="http://schemas.microsoft.com/office/word/2020/wordml/sdtdatahash" xmlns:w16sdtfl="http://schemas.microsoft.com/office/word/2024/wordml/sdtformatlock" xmlns:w16se="http://schemas.microsoft.com/office/word/2015/wordml/symex" xmlns:wpg="http://schemas.microsoft.com/office/word/2010/wordprocessingGroup" xmlns:wpi="http://schemas.microsoft.com/office/word/2010/wordprocessingInk" xmlns:wne="http://schemas.microsoft.com/office/word/2006/wordml" xmlns:wps="http://schemas.microsoft.com/office/word/2010/wordprocessingShape" mc:Ignorable="w14 w15 w16se w16cid w16 w16cex w16sdtdh w16sdtfl w16du wp14">
+<w:footnotes xmlns:wpc="http://schemas.microsoft.com/office/word/2010/wordprocessingCanvas" xmlns:cx="http://schemas.microsoft.com/office/drawing/2014/chartex" xmlns:cx1="http://schemas.microsoft.com/office/drawing/2015/9/8/chartex" xmlns:cx2="http://schemas.microsoft.com/office/drawing/2015/10/21/chartex" xmlns:cx3="http://schemas.microsoft.com/office/drawing/2016/5/9/chartex" xmlns:cx4="http://schemas.microsoft.com/office/drawing/2016/5/10/chartex" xmlns:cx5="http://schemas.microsoft.com/office/drawing/2016/5/11/chartex" xmlns:cx6="http://schemas.microsoft.com/office/drawing/2016/5/12/chartex" xmlns:cx7="http://schemas.microsoft.com/office/drawing/2016/5/13/chartex" xmlns:cx8="http://schemas.microsoft.com/office/drawing/2016/5/14/chartex" xmlns:mc="http://schemas.openxmlformats.org/markup-compatibility/2006" xmlns:aink="http://schemas.microsoft.com/office/drawing/2016/ink" xmlns:am3d="http://schemas.microsoft.com/office/drawing/2017/model3d" xmlns:o="urn:schemas-microsoft-com:office:office" xmlns:oel="http://schemas.microsoft.com/office/2019/extlst" xmlns:r="http://schemas.openxmlformats.org/officeDocument/2006/relationships" xmlns:m="http://schemas.openxmlformats.org/officeDocument/2006/math" xmlns:v="urn:schemas-microsoft-com:vml" xmlns:wp14="http://schemas.microsoft.com/office/word/2010/wordprocessingDrawing" xmlns:wp="http://schemas.openxmlformats.org/drawingml/2006/wordprocessingDrawing" xmlns:w10="urn:schemas-microsoft-com:office:word" xmlns:w="http://schemas.openxmlformats.org/wordprocessingml/2006/main" xmlns:w14="http://schemas.microsoft.com/office/word/2010/wordml" xmlns:w15="http://schemas.microsoft.com/office/word/2012/wordml" xmlns:w16cex="http://schemas.microsoft.com/office/word/2018/wordml/cex" xmlns:w16cid="http://schemas.microsoft.com/office/word/2016/wordml/cid" xmlns:w16="http://schemas.microsoft.com/office/word/2018/wordml" xmlns:w16du="http://schemas.microsoft.com/office/word/2023/wordml/word16du" xmlns:w16sdtdh="http://schemas.microsoft.com/office/word/2020/wordml/sdtdatahash" xmlns:w16sdtfl="http://schemas.microsoft.com/office/word/2024/wordml/sdtformatlock" xmlns:w16se="http://schemas.microsoft.com/office/word/2015/wordml/symex" xmlns:wpg="http://schemas.microsoft.com/office/word/2010/wordprocessingGroup" xmlns:wpi="http://schemas.microsoft.com/office/word/2010/wordprocessingInk" xmlns:wne="http://schemas.microsoft.com/office/word/2006/wordml" xmlns:wps="http://schemas.microsoft.com/office/word/2010/wordprocessingShape" mc:Ignorable="w14 w15 w16se w16cid w16 w16cex w16sdtdh w16sdtfl w16du wp14">
   <w:footnote w:type="separator" w:id="-1">
     <w:p>
       <w:pPr>
@@ -16023,13 +16113,13 @@
 </file>
 
 <file path=word/header1.xml><?xml version="1.0" encoding="utf-8"?>
-<w:hdr xmlns:wpc="http://schemas.microsoft.com/office/word/2010/wordprocessingCanvas" xmlns:cx="http://schemas.microsoft.com/office/drawing/2014/chartex" xmlns:cx1="http://schemas.microsoft.com/office/drawing/2015/9/8/chartex" xmlns:cx2="http://schemas.microsoft.com/office/drawing/2015/10/21/chartex" xmlns:cx3="http://schemas.microsoft.com/office/drawing/2016/5/9/chartex" xmlns:cx4="http://schemas.microsoft.com/office/drawing/2016/5/10/chartex" xmlns:cx5="http://schemas.microsoft.com/office/drawing/2016/5/11/chartex" xmlns:cx6="http://schemas.microsoft.com/office/drawing/2016/5/12/chartex" xmlns:cx7="http://schemas.microsoft.com/office/drawing/2016/5/13/chartex" xmlns:cx8="http://schemas.microsoft.com/office/drawing/2016/5/14/chartex" xmlns:mc="http://schemas.openxmlformats.org/markup-compatibility/2006" xmlns:aink="http://schemas.microsoft.com/office/drawing/2016/ink" xmlns:am3d="http://schemas.microsoft.com/office/drawing/2017/model3d" xmlns:o="urn:schemas-microsoft-com:office:office" xmlns:oel="http://schemas.microsoft.com/office/2019/extlst" xmlns:r="http://schemas.openxmlformats.org/officeDocument/2006/relationships" xmlns:m="http://schemas.openxmlformats.org/officeDocument/2006/math" xmlns:v="urn:schemas-microsoft-com:vml" xmlns:wp14="http://schemas.microsoft.com/office/word/2010/wordprocessingDrawing" xmlns:wp="http://schemas.openxmlformats.org/drawingml/2006/wordprocessingDrawing" xmlns:w10="urn:schemas-microsoft-com:office:word" xmlns:w="http://schemas.openxmlformats.org/wordprocessingml/2006/main" xmlns:w14="http://schemas.microsoft.com/office/word/2010/wordml" xmlns:w15="http://schemas.microsoft.com/office/word/2012/wordml" xmlns:w16cei="http://schemas.microsoft.com/office/word/2026/wordml/cei" xmlns:w16cex="http://schemas.microsoft.com/office/word/2018/wordml/cex" xmlns:w16cid="http://schemas.microsoft.com/office/word/2016/wordml/cid" xmlns:w16="http://schemas.microsoft.com/office/word/2018/wordml" xmlns:w16du="http://schemas.microsoft.com/office/word/2023/wordml/word16du" xmlns:w16sdtdh="http://schemas.microsoft.com/office/word/2020/wordml/sdtdatahash" xmlns:w16sdtfl="http://schemas.microsoft.com/office/word/2024/wordml/sdtformatlock" xmlns:w16se="http://schemas.microsoft.com/office/word/2015/wordml/symex" xmlns:wpg="http://schemas.microsoft.com/office/word/2010/wordprocessingGroup" xmlns:wpi="http://schemas.microsoft.com/office/word/2010/wordprocessingInk" xmlns:wne="http://schemas.microsoft.com/office/word/2006/wordml" xmlns:wps="http://schemas.microsoft.com/office/word/2010/wordprocessingShape" mc:Ignorable="w14 w15 w16se w16cid w16 w16cex w16sdtdh w16sdtfl w16du wp14">
+<w:hdr xmlns:wpc="http://schemas.microsoft.com/office/word/2010/wordprocessingCanvas" xmlns:cx="http://schemas.microsoft.com/office/drawing/2014/chartex" xmlns:cx1="http://schemas.microsoft.com/office/drawing/2015/9/8/chartex" xmlns:cx2="http://schemas.microsoft.com/office/drawing/2015/10/21/chartex" xmlns:cx3="http://schemas.microsoft.com/office/drawing/2016/5/9/chartex" xmlns:cx4="http://schemas.microsoft.com/office/drawing/2016/5/10/chartex" xmlns:cx5="http://schemas.microsoft.com/office/drawing/2016/5/11/chartex" xmlns:cx6="http://schemas.microsoft.com/office/drawing/2016/5/12/chartex" xmlns:cx7="http://schemas.microsoft.com/office/drawing/2016/5/13/chartex" xmlns:cx8="http://schemas.microsoft.com/office/drawing/2016/5/14/chartex" xmlns:mc="http://schemas.openxmlformats.org/markup-compatibility/2006" xmlns:aink="http://schemas.microsoft.com/office/drawing/2016/ink" xmlns:am3d="http://schemas.microsoft.com/office/drawing/2017/model3d" xmlns:o="urn:schemas-microsoft-com:office:office" xmlns:oel="http://schemas.microsoft.com/office/2019/extlst" xmlns:r="http://schemas.openxmlformats.org/officeDocument/2006/relationships" xmlns:m="http://schemas.openxmlformats.org/officeDocument/2006/math" xmlns:v="urn:schemas-microsoft-com:vml" xmlns:wp14="http://schemas.microsoft.com/office/word/2010/wordprocessingDrawing" xmlns:wp="http://schemas.openxmlformats.org/drawingml/2006/wordprocessingDrawing" xmlns:w10="urn:schemas-microsoft-com:office:word" xmlns:w="http://schemas.openxmlformats.org/wordprocessingml/2006/main" xmlns:w14="http://schemas.microsoft.com/office/word/2010/wordml" xmlns:w15="http://schemas.microsoft.com/office/word/2012/wordml" xmlns:w16cex="http://schemas.microsoft.com/office/word/2018/wordml/cex" xmlns:w16cid="http://schemas.microsoft.com/office/word/2016/wordml/cid" xmlns:w16="http://schemas.microsoft.com/office/word/2018/wordml" xmlns:w16du="http://schemas.microsoft.com/office/word/2023/wordml/word16du" xmlns:w16sdtdh="http://schemas.microsoft.com/office/word/2020/wordml/sdtdatahash" xmlns:w16sdtfl="http://schemas.microsoft.com/office/word/2024/wordml/sdtformatlock" xmlns:w16se="http://schemas.microsoft.com/office/word/2015/wordml/symex" xmlns:wpg="http://schemas.microsoft.com/office/word/2010/wordprocessingGroup" xmlns:wpi="http://schemas.microsoft.com/office/word/2010/wordprocessingInk" xmlns:wne="http://schemas.microsoft.com/office/word/2006/wordml" xmlns:wps="http://schemas.microsoft.com/office/word/2010/wordprocessingShape" mc:Ignorable="w14 w15 w16se w16cid w16 w16cex w16sdtdh w16sdtfl w16du wp14">
   <w:p/>
 </w:hdr>
 </file>
 
 <file path=word/numbering.xml><?xml version="1.0" encoding="utf-8"?>
-<w:numbering xmlns:wpc="http://schemas.microsoft.com/office/word/2010/wordprocessingCanvas" xmlns:cx="http://schemas.microsoft.com/office/drawing/2014/chartex" xmlns:cx1="http://schemas.microsoft.com/office/drawing/2015/9/8/chartex" xmlns:cx2="http://schemas.microsoft.com/office/drawing/2015/10/21/chartex" xmlns:cx3="http://schemas.microsoft.com/office/drawing/2016/5/9/chartex" xmlns:cx4="http://schemas.microsoft.com/office/drawing/2016/5/10/chartex" xmlns:cx5="http://schemas.microsoft.com/office/drawing/2016/5/11/chartex" xmlns:cx6="http://schemas.microsoft.com/office/drawing/2016/5/12/chartex" xmlns:cx7="http://schemas.microsoft.com/office/drawing/2016/5/13/chartex" xmlns:cx8="http://schemas.microsoft.com/office/drawing/2016/5/14/chartex" xmlns:mc="http://schemas.openxmlformats.org/markup-compatibility/2006" xmlns:aink="http://schemas.microsoft.com/office/drawing/2016/ink" xmlns:am3d="http://schemas.microsoft.com/office/drawing/2017/model3d" xmlns:o="urn:schemas-microsoft-com:office:office" xmlns:oel="http://schemas.microsoft.com/office/2019/extlst" xmlns:r="http://schemas.openxmlformats.org/officeDocument/2006/relationships" xmlns:m="http://schemas.openxmlformats.org/officeDocument/2006/math" xmlns:v="urn:schemas-microsoft-com:vml" xmlns:wp14="http://schemas.microsoft.com/office/word/2010/wordprocessingDrawing" xmlns:wp="http://schemas.openxmlformats.org/drawingml/2006/wordprocessingDrawing" xmlns:w10="urn:schemas-microsoft-com:office:word" xmlns:w="http://schemas.openxmlformats.org/wordprocessingml/2006/main" xmlns:w14="http://schemas.microsoft.com/office/word/2010/wordml" xmlns:w15="http://schemas.microsoft.com/office/word/2012/wordml" xmlns:w16cei="http://schemas.microsoft.com/office/word/2026/wordml/cei" xmlns:w16cex="http://schemas.microsoft.com/office/word/2018/wordml/cex" xmlns:w16cid="http://schemas.microsoft.com/office/word/2016/wordml/cid" xmlns:w16="http://schemas.microsoft.com/office/word/2018/wordml" xmlns:w16du="http://schemas.microsoft.com/office/word/2023/wordml/word16du" xmlns:w16sdtdh="http://schemas.microsoft.com/office/word/2020/wordml/sdtdatahash" xmlns:w16sdtfl="http://schemas.microsoft.com/office/word/2024/wordml/sdtformatlock" xmlns:w16se="http://schemas.microsoft.com/office/word/2015/wordml/symex" xmlns:wpg="http://schemas.microsoft.com/office/word/2010/wordprocessingGroup" xmlns:wpi="http://schemas.microsoft.com/office/word/2010/wordprocessingInk" xmlns:wne="http://schemas.microsoft.com/office/word/2006/wordml" xmlns:wps="http://schemas.microsoft.com/office/word/2010/wordprocessingShape" mc:Ignorable="w14 w15 w16se w16cid w16 w16cex w16sdtdh w16sdtfl w16du wp14">
+<w:numbering xmlns:wpc="http://schemas.microsoft.com/office/word/2010/wordprocessingCanvas" xmlns:cx="http://schemas.microsoft.com/office/drawing/2014/chartex" xmlns:cx1="http://schemas.microsoft.com/office/drawing/2015/9/8/chartex" xmlns:cx2="http://schemas.microsoft.com/office/drawing/2015/10/21/chartex" xmlns:cx3="http://schemas.microsoft.com/office/drawing/2016/5/9/chartex" xmlns:cx4="http://schemas.microsoft.com/office/drawing/2016/5/10/chartex" xmlns:cx5="http://schemas.microsoft.com/office/drawing/2016/5/11/chartex" xmlns:cx6="http://schemas.microsoft.com/office/drawing/2016/5/12/chartex" xmlns:cx7="http://schemas.microsoft.com/office/drawing/2016/5/13/chartex" xmlns:cx8="http://schemas.microsoft.com/office/drawing/2016/5/14/chartex" xmlns:mc="http://schemas.openxmlformats.org/markup-compatibility/2006" xmlns:aink="http://schemas.microsoft.com/office/drawing/2016/ink" xmlns:am3d="http://schemas.microsoft.com/office/drawing/2017/model3d" xmlns:o="urn:schemas-microsoft-com:office:office" xmlns:oel="http://schemas.microsoft.com/office/2019/extlst" xmlns:r="http://schemas.openxmlformats.org/officeDocument/2006/relationships" xmlns:m="http://schemas.openxmlformats.org/officeDocument/2006/math" xmlns:v="urn:schemas-microsoft-com:vml" xmlns:wp14="http://schemas.microsoft.com/office/word/2010/wordprocessingDrawing" xmlns:wp="http://schemas.openxmlformats.org/drawingml/2006/wordprocessingDrawing" xmlns:w10="urn:schemas-microsoft-com:office:word" xmlns:w="http://schemas.openxmlformats.org/wordprocessingml/2006/main" xmlns:w14="http://schemas.microsoft.com/office/word/2010/wordml" xmlns:w15="http://schemas.microsoft.com/office/word/2012/wordml" xmlns:w16cex="http://schemas.microsoft.com/office/word/2018/wordml/cex" xmlns:w16cid="http://schemas.microsoft.com/office/word/2016/wordml/cid" xmlns:w16="http://schemas.microsoft.com/office/word/2018/wordml" xmlns:w16du="http://schemas.microsoft.com/office/word/2023/wordml/word16du" xmlns:w16sdtdh="http://schemas.microsoft.com/office/word/2020/wordml/sdtdatahash" xmlns:w16sdtfl="http://schemas.microsoft.com/office/word/2024/wordml/sdtformatlock" xmlns:w16se="http://schemas.microsoft.com/office/word/2015/wordml/symex" xmlns:wpg="http://schemas.microsoft.com/office/word/2010/wordprocessingGroup" xmlns:wpi="http://schemas.microsoft.com/office/word/2010/wordprocessingInk" xmlns:wne="http://schemas.microsoft.com/office/word/2006/wordml" xmlns:wps="http://schemas.microsoft.com/office/word/2010/wordprocessingShape" mc:Ignorable="w14 w15 w16se w16cid w16 w16cex w16sdtdh w16sdtfl w16du wp14">
   <w:abstractNum w:abstractNumId="0" w15:restartNumberingAfterBreak="0">
     <w:nsid w:val="03436172"/>
     <w:multiLevelType w:val="hybridMultilevel"/>
@@ -16208,6 +16298,119 @@
     </w:lvl>
   </w:abstractNum>
   <w:abstractNum w:abstractNumId="2" w15:restartNumberingAfterBreak="0">
+    <w:nsid w:val="130145F4"/>
+    <w:multiLevelType w:val="hybridMultilevel"/>
+    <w:tmpl w:val="DC68072E"/>
+    <w:lvl w:ilvl="0" w:tplc="2C0A0001">
+      <w:start w:val="1"/>
+      <w:numFmt w:val="bullet"/>
+      <w:lvlText w:val=""/>
+      <w:lvlJc w:val="left"/>
+      <w:pPr>
+        <w:ind w:left="720" w:hanging="360"/>
+      </w:pPr>
+      <w:rPr>
+        <w:rFonts w:ascii="Symbol" w:hAnsi="Symbol" w:hint="default"/>
+      </w:rPr>
+    </w:lvl>
+    <w:lvl w:ilvl="1" w:tplc="2C0A0003" w:tentative="1">
+      <w:start w:val="1"/>
+      <w:numFmt w:val="bullet"/>
+      <w:lvlText w:val="o"/>
+      <w:lvlJc w:val="left"/>
+      <w:pPr>
+        <w:ind w:left="1440" w:hanging="360"/>
+      </w:pPr>
+      <w:rPr>
+        <w:rFonts w:ascii="Courier New" w:hAnsi="Courier New" w:cs="Courier New" w:hint="default"/>
+      </w:rPr>
+    </w:lvl>
+    <w:lvl w:ilvl="2" w:tplc="2C0A0005" w:tentative="1">
+      <w:start w:val="1"/>
+      <w:numFmt w:val="bullet"/>
+      <w:lvlText w:val=""/>
+      <w:lvlJc w:val="left"/>
+      <w:pPr>
+        <w:ind w:left="2160" w:hanging="360"/>
+      </w:pPr>
+      <w:rPr>
+        <w:rFonts w:ascii="Wingdings" w:hAnsi="Wingdings" w:hint="default"/>
+      </w:rPr>
+    </w:lvl>
+    <w:lvl w:ilvl="3" w:tplc="2C0A0001" w:tentative="1">
+      <w:start w:val="1"/>
+      <w:numFmt w:val="bullet"/>
+      <w:lvlText w:val=""/>
+      <w:lvlJc w:val="left"/>
+      <w:pPr>
+        <w:ind w:left="2880" w:hanging="360"/>
+      </w:pPr>
+      <w:rPr>
+        <w:rFonts w:ascii="Symbol" w:hAnsi="Symbol" w:hint="default"/>
+      </w:rPr>
+    </w:lvl>
+    <w:lvl w:ilvl="4" w:tplc="2C0A0003" w:tentative="1">
+      <w:start w:val="1"/>
+      <w:numFmt w:val="bullet"/>
+      <w:lvlText w:val="o"/>
+      <w:lvlJc w:val="left"/>
+      <w:pPr>
+        <w:ind w:left="3600" w:hanging="360"/>
+      </w:pPr>
+      <w:rPr>
+        <w:rFonts w:ascii="Courier New" w:hAnsi="Courier New" w:cs="Courier New" w:hint="default"/>
+      </w:rPr>
+    </w:lvl>
+    <w:lvl w:ilvl="5" w:tplc="2C0A0005" w:tentative="1">
+      <w:start w:val="1"/>
+      <w:numFmt w:val="bullet"/>
+      <w:lvlText w:val=""/>
+      <w:lvlJc w:val="left"/>
+      <w:pPr>
+        <w:ind w:left="4320" w:hanging="360"/>
+      </w:pPr>
+      <w:rPr>
+        <w:rFonts w:ascii="Wingdings" w:hAnsi="Wingdings" w:hint="default"/>
+      </w:rPr>
+    </w:lvl>
+    <w:lvl w:ilvl="6" w:tplc="2C0A0001" w:tentative="1">
+      <w:start w:val="1"/>
+      <w:numFmt w:val="bullet"/>
+      <w:lvlText w:val=""/>
+      <w:lvlJc w:val="left"/>
+      <w:pPr>
+        <w:ind w:left="5040" w:hanging="360"/>
+      </w:pPr>
+      <w:rPr>
+        <w:rFonts w:ascii="Symbol" w:hAnsi="Symbol" w:hint="default"/>
+      </w:rPr>
+    </w:lvl>
+    <w:lvl w:ilvl="7" w:tplc="2C0A0003" w:tentative="1">
+      <w:start w:val="1"/>
+      <w:numFmt w:val="bullet"/>
+      <w:lvlText w:val="o"/>
+      <w:lvlJc w:val="left"/>
+      <w:pPr>
+        <w:ind w:left="5760" w:hanging="360"/>
+      </w:pPr>
+      <w:rPr>
+        <w:rFonts w:ascii="Courier New" w:hAnsi="Courier New" w:cs="Courier New" w:hint="default"/>
+      </w:rPr>
+    </w:lvl>
+    <w:lvl w:ilvl="8" w:tplc="2C0A0005" w:tentative="1">
+      <w:start w:val="1"/>
+      <w:numFmt w:val="bullet"/>
+      <w:lvlText w:val=""/>
+      <w:lvlJc w:val="left"/>
+      <w:pPr>
+        <w:ind w:left="6480" w:hanging="360"/>
+      </w:pPr>
+      <w:rPr>
+        <w:rFonts w:ascii="Wingdings" w:hAnsi="Wingdings" w:hint="default"/>
+      </w:rPr>
+    </w:lvl>
+  </w:abstractNum>
+  <w:abstractNum w:abstractNumId="3" w15:restartNumberingAfterBreak="0">
     <w:nsid w:val="17CF286C"/>
     <w:multiLevelType w:val="multilevel"/>
     <w:tmpl w:val="FA2048FA"/>
@@ -16320,7 +16523,7 @@
       </w:rPr>
     </w:lvl>
   </w:abstractNum>
-  <w:abstractNum w:abstractNumId="3" w15:restartNumberingAfterBreak="0">
+  <w:abstractNum w:abstractNumId="4" w15:restartNumberingAfterBreak="0">
     <w:nsid w:val="33021BB2"/>
     <w:multiLevelType w:val="multilevel"/>
     <w:tmpl w:val="4E94E1E8"/>
@@ -16419,7 +16622,7 @@
       </w:pPr>
     </w:lvl>
   </w:abstractNum>
-  <w:abstractNum w:abstractNumId="4" w15:restartNumberingAfterBreak="0">
+  <w:abstractNum w:abstractNumId="5" w15:restartNumberingAfterBreak="0">
     <w:nsid w:val="34E74159"/>
     <w:multiLevelType w:val="multilevel"/>
     <w:tmpl w:val="85C8C72E"/>
@@ -16532,7 +16735,7 @@
       </w:rPr>
     </w:lvl>
   </w:abstractNum>
-  <w:abstractNum w:abstractNumId="5" w15:restartNumberingAfterBreak="0">
+  <w:abstractNum w:abstractNumId="6" w15:restartNumberingAfterBreak="0">
     <w:nsid w:val="3AFA42E1"/>
     <w:multiLevelType w:val="multilevel"/>
     <w:tmpl w:val="F41EB8E8"/>
@@ -16645,7 +16848,7 @@
       </w:rPr>
     </w:lvl>
   </w:abstractNum>
-  <w:abstractNum w:abstractNumId="6" w15:restartNumberingAfterBreak="0">
+  <w:abstractNum w:abstractNumId="7" w15:restartNumberingAfterBreak="0">
     <w:nsid w:val="6E83707F"/>
     <w:multiLevelType w:val="multilevel"/>
     <w:tmpl w:val="446421E8"/>
@@ -16759,25 +16962,28 @@
     </w:lvl>
   </w:abstractNum>
   <w:num w:numId="1" w16cid:durableId="1214780130">
-    <w:abstractNumId w:val="6"/>
+    <w:abstractNumId w:val="7"/>
   </w:num>
   <w:num w:numId="2" w16cid:durableId="1358460215">
-    <w:abstractNumId w:val="3"/>
+    <w:abstractNumId w:val="4"/>
   </w:num>
   <w:num w:numId="3" w16cid:durableId="554391000">
     <w:abstractNumId w:val="1"/>
   </w:num>
   <w:num w:numId="4" w16cid:durableId="698433226">
-    <w:abstractNumId w:val="2"/>
+    <w:abstractNumId w:val="3"/>
   </w:num>
   <w:num w:numId="5" w16cid:durableId="627052242">
-    <w:abstractNumId w:val="5"/>
+    <w:abstractNumId w:val="6"/>
   </w:num>
   <w:num w:numId="6" w16cid:durableId="120729552">
-    <w:abstractNumId w:val="4"/>
+    <w:abstractNumId w:val="5"/>
   </w:num>
   <w:num w:numId="7" w16cid:durableId="1818373939">
     <w:abstractNumId w:val="0"/>
+  </w:num>
+  <w:num w:numId="8" w16cid:durableId="893128684">
+    <w:abstractNumId w:val="2"/>
   </w:num>
 </w:numbering>
 </file>

</xml_diff>

<commit_message>
actualizacion valores de incapacidad
</commit_message>
<xml_diff>
--- a/templates/Borrador_Demanda_Auto_Auto.docx
+++ b/templates/Borrador_Demanda_Auto_Auto.docx
@@ -1291,6 +1291,35 @@
           <w:szCs w:val="24"/>
         </w:rPr>
       </w:pPr>
+      <w:r>
+        <w:rPr>
+          <w:rFonts w:ascii="Times New Roman" w:eastAsia="Times New Roman" w:hAnsi="Times New Roman" w:cs="Times New Roman"/>
+          <w:sz w:val="24"/>
+          <w:szCs w:val="24"/>
+          <w:highlight w:val="yellow"/>
+        </w:rPr>
+        <w:t>{{</w:t>
+      </w:r>
+      <w:proofErr w:type="spellStart"/>
+      <w:r>
+        <w:rPr>
+          <w:rFonts w:ascii="Times New Roman" w:eastAsia="Times New Roman" w:hAnsi="Times New Roman" w:cs="Times New Roman"/>
+          <w:sz w:val="24"/>
+          <w:szCs w:val="24"/>
+          <w:highlight w:val="yellow"/>
+        </w:rPr>
+        <w:t>Intervencion</w:t>
+      </w:r>
+      <w:proofErr w:type="spellEnd"/>
+      <w:r>
+        <w:rPr>
+          <w:rFonts w:ascii="Times New Roman" w:eastAsia="Times New Roman" w:hAnsi="Times New Roman" w:cs="Times New Roman"/>
+          <w:sz w:val="24"/>
+          <w:szCs w:val="24"/>
+          <w:highlight w:val="yellow"/>
+        </w:rPr>
+        <w:t>}}</w:t>
+      </w:r>
     </w:p>
     <w:p>
       <w:pPr>
@@ -17516,7 +17545,6 @@
   <w:style w:type="character" w:default="1" w:styleId="Fuentedeprrafopredeter">
     <w:name w:val="Default Paragraph Font"/>
     <w:uiPriority w:val="1"/>
-    <w:semiHidden/>
     <w:unhideWhenUsed/>
   </w:style>
   <w:style w:type="table" w:default="1" w:styleId="Tablanormal">

</xml_diff>